<commit_message>
Promote HIER-INDIV/EGAL-COMM composite model to main text, add demographic controls
Relabels conceptual-model boxes, replaces the main-text combined SEM with
the Hierarch-Individualist/Egalitarian-Communitarian composite-group
specification (four-scale version moved to the supplement), threads
demographic controls (age, gender, race, education, income) through every
SEM in the pipeline, and reports the control coefficients in a new
supplemental table.
</commit_message>
<xml_diff>
--- a/_output/cc-behave-supplemental.docx
+++ b/_output/cc-behave-supplemental.docx
@@ -15,31 +15,7 @@
         <w:pStyle w:val="FirstParagraph"/>
       </w:pPr>
       <w:r>
-        <w:t xml:space="preserve">These supplemental materials report the single-orientation structural</w:t>
-      </w:r>
-      <w:r>
-        <w:t xml:space="preserve"> </w:t>
-      </w:r>
-      <w:r>
-        <w:t xml:space="preserve">equation models — cultural cognition predicting the Connectedness to</w:t>
-      </w:r>
-      <w:r>
-        <w:t xml:space="preserve"> </w:t>
-      </w:r>
-      <w:r>
-        <w:t xml:space="preserve">Nature Scale (CNS) and the New Ecological Paradigm (NEP) separately — and</w:t>
-      </w:r>
-      <w:r>
-        <w:t xml:space="preserve"> </w:t>
-      </w:r>
-      <w:r>
-        <w:t xml:space="preserve">the associated mediation analysis. The combined model that integrates both</w:t>
-      </w:r>
-      <w:r>
-        <w:t xml:space="preserve"> </w:t>
-      </w:r>
-      <w:r>
-        <w:t xml:space="preserve">orientations is reported in the main text.</w:t>
+        <w:t xml:space="preserve">These supplemental materials report the single-orientation structural equation models — cultural cognition predicting the Connectedness to Nature Scale (CNS) and the New Ecological Paradigm (NEP) separately — the associated mediation analysis, and the full combined model estimated with the four separate worldview measures (hierarchy, egalitarianism, individualism, communitarianism). The main text reports the combined model with the four worldview measures collapsed into two composite groups, Hierarch-Individualist (HIER-INDIV) and Egalitarian-Communitarian (EGAL-COMM); the four-measure version here is the specification the composite-group model replaces.</w:t>
       </w:r>
     </w:p>
     <w:bookmarkStart w:id="35" w:name="single-orientation-structural-models"/>
@@ -75,7 +51,7 @@
               <w:pStyle w:val="ImageCaption"/>
             </w:pPr>
             <w:r>
-              <w:t xml:space="preserve">Figure 1: Measurement and structural model of cultural cognition, the Connectedness to Nature Scale, and public and private pro-environmental behaviors. Standardized coefficients shown; * p&lt;0.05, ** p&lt;0.01, *** p&lt;0.001.</w:t>
+              <w:t xml:space="preserve">Figure 1: Measurement and structural model of cultural cognition, the Connectedness to Nature Scale, and public and private pro-environmental behaviors. Controlling for age, gender, race, education, and household income (paths not shown). Standardized coefficients shown; * p&lt;0.05, ** p&lt;0.01, *** p&lt;0.001.</w:t>
             </w:r>
           </w:p>
           <w:p>
@@ -154,7 +130,7 @@
               <w:pStyle w:val="ImageCaption"/>
             </w:pPr>
             <w:r>
-              <w:t xml:space="preserve">Figure 2: Measurement and structural model of cultural cognition, the New Ecological Paradigm, and public and private pro-environmental behaviors. Standardized coefficients shown; * p&lt;0.05, ** p&lt;0.01, *** p&lt;0.001.</w:t>
+              <w:t xml:space="preserve">Figure 2: Measurement and structural model of cultural cognition, the New Ecological Paradigm, and public and private pro-environmental behaviors. Controlling for age, gender, race, education, and household income (paths not shown). Standardized coefficients shown; * p&lt;0.05, ** p&lt;0.01, *** p&lt;0.001.</w:t>
             </w:r>
           </w:p>
           <w:p>
@@ -233,7 +209,7 @@
               <w:pStyle w:val="ImageCaption"/>
             </w:pPr>
             <w:r>
-              <w:t xml:space="preserve">Table 1: Model fit statistics for the CNS and NEP single-orientation structural equation models</w:t>
+              <w:t xml:space="preserve">Table 1: Model fit statistics for the CNS and NEP single-orientation structural equation models. Both models control for age, gender, race, education, and household income.</w:t>
             </w:r>
           </w:p>
           <w:tbl>
@@ -411,85 +387,85 @@
                     <w:jc w:val="center"/>
                   </w:pPr>
                   <w:r>
-                    <w:t xml:space="preserve">100</w:t>
-                  </w:r>
-                </w:p>
-              </w:tc>
-              <w:tc>
-                <w:tcPr/>
-                <w:p>
-                  <w:pPr>
-                    <w:pStyle w:val="Compact"/>
-                    <w:jc w:val="right"/>
-                    <w:jc w:val="center"/>
-                  </w:pPr>
-                  <w:r>
-                    <w:t xml:space="preserve">227.27</w:t>
-                  </w:r>
-                </w:p>
-              </w:tc>
-              <w:tc>
-                <w:tcPr/>
-                <w:p>
-                  <w:pPr>
-                    <w:pStyle w:val="Compact"/>
-                    <w:jc w:val="right"/>
-                    <w:jc w:val="center"/>
-                  </w:pPr>
-                  <w:r>
-                    <w:t xml:space="preserve">0.050</w:t>
-                  </w:r>
-                </w:p>
-              </w:tc>
-              <w:tc>
-                <w:tcPr/>
-                <w:p>
-                  <w:pPr>
-                    <w:pStyle w:val="Compact"/>
-                    <w:jc w:val="right"/>
-                    <w:jc w:val="center"/>
-                  </w:pPr>
-                  <w:r>
-                    <w:t xml:space="preserve">[0.042, 0.059]</w:t>
-                  </w:r>
-                </w:p>
-              </w:tc>
-              <w:tc>
-                <w:tcPr/>
-                <w:p>
-                  <w:pPr>
-                    <w:pStyle w:val="Compact"/>
-                    <w:jc w:val="right"/>
-                    <w:jc w:val="center"/>
-                  </w:pPr>
-                  <w:r>
-                    <w:t xml:space="preserve">0.954</w:t>
-                  </w:r>
-                </w:p>
-              </w:tc>
-              <w:tc>
-                <w:tcPr/>
-                <w:p>
-                  <w:pPr>
-                    <w:pStyle w:val="Compact"/>
-                    <w:jc w:val="right"/>
-                    <w:jc w:val="center"/>
-                  </w:pPr>
-                  <w:r>
-                    <w:t xml:space="preserve">0.937</w:t>
-                  </w:r>
-                </w:p>
-              </w:tc>
-              <w:tc>
-                <w:tcPr/>
-                <w:p>
-                  <w:pPr>
-                    <w:pStyle w:val="Compact"/>
-                    <w:jc w:val="right"/>
-                    <w:jc w:val="center"/>
-                  </w:pPr>
-                  <w:r>
-                    <w:t xml:space="preserve">0.049</w:t>
+                    <w:t xml:space="preserve">170</w:t>
+                  </w:r>
+                </w:p>
+              </w:tc>
+              <w:tc>
+                <w:tcPr/>
+                <w:p>
+                  <w:pPr>
+                    <w:pStyle w:val="Compact"/>
+                    <w:jc w:val="right"/>
+                    <w:jc w:val="center"/>
+                  </w:pPr>
+                  <w:r>
+                    <w:t xml:space="preserve">447.42</w:t>
+                  </w:r>
+                </w:p>
+              </w:tc>
+              <w:tc>
+                <w:tcPr/>
+                <w:p>
+                  <w:pPr>
+                    <w:pStyle w:val="Compact"/>
+                    <w:jc w:val="right"/>
+                    <w:jc w:val="center"/>
+                  </w:pPr>
+                  <w:r>
+                    <w:t xml:space="preserve">0.057</w:t>
+                  </w:r>
+                </w:p>
+              </w:tc>
+              <w:tc>
+                <w:tcPr/>
+                <w:p>
+                  <w:pPr>
+                    <w:pStyle w:val="Compact"/>
+                    <w:jc w:val="right"/>
+                    <w:jc w:val="center"/>
+                  </w:pPr>
+                  <w:r>
+                    <w:t xml:space="preserve">[0.051, 0.064]</w:t>
+                  </w:r>
+                </w:p>
+              </w:tc>
+              <w:tc>
+                <w:tcPr/>
+                <w:p>
+                  <w:pPr>
+                    <w:pStyle w:val="Compact"/>
+                    <w:jc w:val="right"/>
+                    <w:jc w:val="center"/>
+                  </w:pPr>
+                  <w:r>
+                    <w:t xml:space="preserve">0.906</w:t>
+                  </w:r>
+                </w:p>
+              </w:tc>
+              <w:tc>
+                <w:tcPr/>
+                <w:p>
+                  <w:pPr>
+                    <w:pStyle w:val="Compact"/>
+                    <w:jc w:val="right"/>
+                    <w:jc w:val="center"/>
+                  </w:pPr>
+                  <w:r>
+                    <w:t xml:space="preserve">0.877</w:t>
+                  </w:r>
+                </w:p>
+              </w:tc>
+              <w:tc>
+                <w:tcPr/>
+                <w:p>
+                  <w:pPr>
+                    <w:pStyle w:val="Compact"/>
+                    <w:jc w:val="right"/>
+                    <w:jc w:val="center"/>
+                  </w:pPr>
+                  <w:r>
+                    <w:t xml:space="preserve">0.077</w:t>
                   </w:r>
                 </w:p>
               </w:tc>
@@ -530,85 +506,85 @@
                     <w:jc w:val="center"/>
                   </w:pPr>
                   <w:r>
-                    <w:t xml:space="preserve">100</w:t>
-                  </w:r>
-                </w:p>
-              </w:tc>
-              <w:tc>
-                <w:tcPr/>
-                <w:p>
-                  <w:pPr>
-                    <w:pStyle w:val="Compact"/>
-                    <w:jc w:val="right"/>
-                    <w:jc w:val="center"/>
-                  </w:pPr>
-                  <w:r>
-                    <w:t xml:space="preserve">371.14</w:t>
-                  </w:r>
-                </w:p>
-              </w:tc>
-              <w:tc>
-                <w:tcPr/>
-                <w:p>
-                  <w:pPr>
-                    <w:pStyle w:val="Compact"/>
-                    <w:jc w:val="right"/>
-                    <w:jc w:val="center"/>
-                  </w:pPr>
-                  <w:r>
-                    <w:t xml:space="preserve">0.074</w:t>
-                  </w:r>
-                </w:p>
-              </w:tc>
-              <w:tc>
-                <w:tcPr/>
-                <w:p>
-                  <w:pPr>
-                    <w:pStyle w:val="Compact"/>
-                    <w:jc w:val="right"/>
-                    <w:jc w:val="center"/>
-                  </w:pPr>
-                  <w:r>
-                    <w:t xml:space="preserve">[0.066, 0.082]</w:t>
-                  </w:r>
-                </w:p>
-              </w:tc>
-              <w:tc>
-                <w:tcPr/>
-                <w:p>
-                  <w:pPr>
-                    <w:pStyle w:val="Compact"/>
-                    <w:jc w:val="right"/>
-                    <w:jc w:val="center"/>
-                  </w:pPr>
-                  <w:r>
-                    <w:t xml:space="preserve">0.911</w:t>
-                  </w:r>
-                </w:p>
-              </w:tc>
-              <w:tc>
-                <w:tcPr/>
-                <w:p>
-                  <w:pPr>
-                    <w:pStyle w:val="Compact"/>
-                    <w:jc w:val="right"/>
-                    <w:jc w:val="center"/>
-                  </w:pPr>
-                  <w:r>
-                    <w:t xml:space="preserve">0.879</w:t>
-                  </w:r>
-                </w:p>
-              </w:tc>
-              <w:tc>
-                <w:tcPr/>
-                <w:p>
-                  <w:pPr>
-                    <w:pStyle w:val="Compact"/>
-                    <w:jc w:val="right"/>
-                    <w:jc w:val="center"/>
-                  </w:pPr>
-                  <w:r>
-                    <w:t xml:space="preserve">0.067</w:t>
+                    <w:t xml:space="preserve">170</w:t>
+                  </w:r>
+                </w:p>
+              </w:tc>
+              <w:tc>
+                <w:tcPr/>
+                <w:p>
+                  <w:pPr>
+                    <w:pStyle w:val="Compact"/>
+                    <w:jc w:val="right"/>
+                    <w:jc w:val="center"/>
+                  </w:pPr>
+                  <w:r>
+                    <w:t xml:space="preserve">608.59</w:t>
+                  </w:r>
+                </w:p>
+              </w:tc>
+              <w:tc>
+                <w:tcPr/>
+                <w:p>
+                  <w:pPr>
+                    <w:pStyle w:val="Compact"/>
+                    <w:jc w:val="right"/>
+                    <w:jc w:val="center"/>
+                  </w:pPr>
+                  <w:r>
+                    <w:t xml:space="preserve">0.072</w:t>
+                  </w:r>
+                </w:p>
+              </w:tc>
+              <w:tc>
+                <w:tcPr/>
+                <w:p>
+                  <w:pPr>
+                    <w:pStyle w:val="Compact"/>
+                    <w:jc w:val="right"/>
+                    <w:jc w:val="center"/>
+                  </w:pPr>
+                  <w:r>
+                    <w:t xml:space="preserve">[0.066, 0.078]</w:t>
+                  </w:r>
+                </w:p>
+              </w:tc>
+              <w:tc>
+                <w:tcPr/>
+                <w:p>
+                  <w:pPr>
+                    <w:pStyle w:val="Compact"/>
+                    <w:jc w:val="right"/>
+                    <w:jc w:val="center"/>
+                  </w:pPr>
+                  <w:r>
+                    <w:t xml:space="preserve">0.866</w:t>
+                  </w:r>
+                </w:p>
+              </w:tc>
+              <w:tc>
+                <w:tcPr/>
+                <w:p>
+                  <w:pPr>
+                    <w:pStyle w:val="Compact"/>
+                    <w:jc w:val="right"/>
+                    <w:jc w:val="center"/>
+                  </w:pPr>
+                  <w:r>
+                    <w:t xml:space="preserve">0.826</w:t>
+                  </w:r>
+                </w:p>
+              </w:tc>
+              <w:tc>
+                <w:tcPr/>
+                <w:p>
+                  <w:pPr>
+                    <w:pStyle w:val="Compact"/>
+                    <w:jc w:val="right"/>
+                    <w:jc w:val="center"/>
+                  </w:pPr>
+                  <w:r>
+                    <w:t xml:space="preserve">0.088</w:t>
                   </w:r>
                 </w:p>
               </w:tc>
@@ -620,13 +596,13 @@
       </w:tr>
     </w:tbl>
     <w:bookmarkEnd w:id="35"/>
-    <w:bookmarkStart w:id="40" w:name="X6ae8f49109075555e434b86493e1683070a13c8"/>
+    <w:bookmarkStart w:id="42" w:name="X627d865e4c53eb7b73f71825712314709167a98"/>
     <w:p>
       <w:pPr>
         <w:pStyle w:val="Heading1"/>
       </w:pPr>
       <w:r>
-        <w:t xml:space="preserve">Full combined model with measurement detail</w:t>
+        <w:t xml:space="preserve">Full combined model with the four separate worldview measures</w:t>
       </w:r>
     </w:p>
     <w:p>
@@ -634,25 +610,7 @@
         <w:pStyle w:val="FirstParagraph"/>
       </w:pPr>
       <w:r>
-        <w:t xml:space="preserve">The main text reports the structural portion of the full combined model</w:t>
-      </w:r>
-      <w:r>
-        <w:t xml:space="preserve"> </w:t>
-      </w:r>
-      <w:r>
-        <w:t xml:space="preserve">(cultural cognition → NEP → CNS → behavior, with direct paths). Figure S3</w:t>
-      </w:r>
-      <w:r>
-        <w:t xml:space="preserve"> </w:t>
-      </w:r>
-      <w:r>
-        <w:t xml:space="preserve">shows the same model with the full measurement model — the latent constructs</w:t>
-      </w:r>
-      <w:r>
-        <w:t xml:space="preserve"> </w:t>
-      </w:r>
-      <w:r>
-        <w:t xml:space="preserve">and their indicators — included.</w:t>
+        <w:t xml:space="preserve">This section reports the full combined model (cultural worldviews → NEP → CNS → behavior, with direct paths) estimated with the four separate worldview measures — hierarchy, egalitarianism, individualism, and communitarianism — as latent predictors. The main text reports the same model with these four measures collapsed into the two composite groups described above; this specification is the one the composite-group model replaces.</w:t>
       </w:r>
     </w:p>
     <w:tbl>
@@ -668,7 +626,7 @@
       <w:tr>
         <w:tc>
           <w:tcPr/>
-          <w:bookmarkStart w:id="39" w:name="fig-serial"/>
+          <w:bookmarkStart w:id="39" w:name="fig-structural-4wv"/>
           <w:p>
             <w:pPr>
               <w:jc w:val="center"/>
@@ -679,7 +637,7 @@
               <w:pStyle w:val="ImageCaption"/>
             </w:pPr>
             <w:r>
-              <w:t xml:space="preserve">Figure 3: Full combined model including the measurement model (latent constructs and their indicators) and the structural paths: cultural cognition → New Ecological Paradigm → Connectedness to Nature → public and private pro-environmental behavior, with direct paths. Standardized coefficients shown; * p&lt;0.05, ** p&lt;0.01, *** p&lt;0.001.</w:t>
+              <w:t xml:space="preserve">Figure 3: Structural model of the full combined SEM with the four separate worldview measures: cultural cognition → New Ecological Paradigm → Connectedness to Nature → public and private pro-environmental behavior, with direct paths. Controlling for age, gender, race, education, and household income (paths not shown). The measurement (indicator) portion is omitted for clarity; standardized coefficients shown; * p&lt;0.05, ** p&lt;0.01, *** p&lt;0.001.</w:t>
             </w:r>
           </w:p>
           <w:p>
@@ -697,7 +655,7 @@
                     <a:graphicData uri="http://schemas.openxmlformats.org/drawingml/2006/picture">
                       <pic:pic>
                         <pic:nvPicPr>
-                          <pic:cNvPr descr="cc-behave-supplemental_files/figure-docx/fig-serial-1.png" id="38" name="Picture"/>
+                          <pic:cNvPr descr="cc-behave-supplemental_files/figure-docx/fig-structural-4wv-1.png" id="38" name="Picture"/>
                           <pic:cNvPicPr>
                             <a:picLocks noChangeArrowheads="1" noChangeAspect="1"/>
                           </pic:cNvPicPr>
@@ -734,8 +692,1428 @@
         </w:tc>
       </w:tr>
     </w:tbl>
-    <w:bookmarkEnd w:id="40"/>
-    <w:bookmarkStart w:id="42" w:name="mediation-analysis"/>
+    <w:tbl>
+      <w:tblPr>
+        <w:tblStyle w:val="Table"/>
+        <w:tblW w:type="pct" w:w="5000"/>
+        <w:tblLayout w:type="fixed"/>
+        <w:tblLook w:firstRow="0" w:lastRow="0" w:firstColumn="0" w:lastColumn="0" w:noHBand="0" w:noVBand="0" w:val="0000"/>
+      </w:tblPr>
+      <w:tblGrid>
+        <w:gridCol w:w="7920"/>
+      </w:tblGrid>
+      <w:tr>
+        <w:tc>
+          <w:tcPr/>
+          <w:bookmarkStart w:id="40" w:name="tbl-serial-fit-4wv"/>
+          <w:p>
+            <w:pPr>
+              <w:jc w:val="center"/>
+            </w:pPr>
+            <w:pPr>
+              <w:jc w:val="left"/>
+              <w:spacing w:before="200"/>
+              <w:pStyle w:val="ImageCaption"/>
+            </w:pPr>
+            <w:r>
+              <w:t xml:space="preserve">Table 2: Fit comparison of the strict serial chain versus the full combined model with direct paths added, four separate worldview measures. Both models control for age, gender, race, education, and household income.</w:t>
+            </w:r>
+          </w:p>
+          <w:tbl>
+            <w:tblPr>
+              <w:tblStyle w:val="Table"/>
+              <w:tblW w:type="pct" w:w="5000"/>
+              <w:tblLayout w:type="fixed"/>
+              <w:tblLook w:firstRow="1" w:lastRow="0" w:firstColumn="0" w:lastColumn="0" w:noHBand="0" w:noVBand="0" w:val="0020"/>
+            </w:tblPr>
+            <w:tblGrid>
+              <w:gridCol w:w="1980"/>
+              <w:gridCol w:w="630"/>
+              <w:gridCol w:w="360"/>
+              <w:gridCol w:w="540"/>
+              <w:gridCol w:w="540"/>
+              <w:gridCol w:w="540"/>
+              <w:gridCol w:w="1350"/>
+              <w:gridCol w:w="540"/>
+              <w:gridCol w:w="720"/>
+              <w:gridCol w:w="720"/>
+            </w:tblGrid>
+            <w:tr>
+              <w:trPr>
+                <w:tblHeader w:val="on"/>
+              </w:trPr>
+              <w:tc>
+                <w:tcPr/>
+                <w:p>
+                  <w:pPr>
+                    <w:pStyle w:val="Compact"/>
+                    <w:jc w:val="left"/>
+                    <w:jc w:val="center"/>
+                  </w:pPr>
+                  <w:r>
+                    <w:t xml:space="preserve">Model</w:t>
+                  </w:r>
+                </w:p>
+              </w:tc>
+              <w:tc>
+                <w:tcPr/>
+                <w:p>
+                  <w:pPr>
+                    <w:pStyle w:val="Compact"/>
+                    <w:jc w:val="right"/>
+                    <w:jc w:val="center"/>
+                  </w:pPr>
+                  <w:r>
+                    <w:t xml:space="preserve">Chi-sq</w:t>
+                  </w:r>
+                </w:p>
+              </w:tc>
+              <w:tc>
+                <w:tcPr/>
+                <w:p>
+                  <w:pPr>
+                    <w:pStyle w:val="Compact"/>
+                    <w:jc w:val="right"/>
+                    <w:jc w:val="center"/>
+                  </w:pPr>
+                  <w:r>
+                    <w:t xml:space="preserve">df</w:t>
+                  </w:r>
+                </w:p>
+              </w:tc>
+              <w:tc>
+                <w:tcPr/>
+                <w:p>
+                  <w:pPr>
+                    <w:pStyle w:val="Compact"/>
+                    <w:jc w:val="right"/>
+                    <w:jc w:val="center"/>
+                  </w:pPr>
+                  <w:r>
+                    <w:t xml:space="preserve">CFI</w:t>
+                  </w:r>
+                </w:p>
+              </w:tc>
+              <w:tc>
+                <w:tcPr/>
+                <w:p>
+                  <w:pPr>
+                    <w:pStyle w:val="Compact"/>
+                    <w:jc w:val="right"/>
+                    <w:jc w:val="center"/>
+                  </w:pPr>
+                  <w:r>
+                    <w:t xml:space="preserve">TLI</w:t>
+                  </w:r>
+                </w:p>
+              </w:tc>
+              <w:tc>
+                <w:tcPr/>
+                <w:p>
+                  <w:pPr>
+                    <w:pStyle w:val="Compact"/>
+                    <w:jc w:val="right"/>
+                    <w:jc w:val="center"/>
+                  </w:pPr>
+                  <w:r>
+                    <w:t xml:space="preserve">RMSEA</w:t>
+                  </w:r>
+                </w:p>
+              </w:tc>
+              <w:tc>
+                <w:tcPr/>
+                <w:p>
+                  <w:pPr>
+                    <w:pStyle w:val="Compact"/>
+                    <w:jc w:val="right"/>
+                    <w:jc w:val="center"/>
+                  </w:pPr>
+                  <w:r>
+                    <w:t xml:space="preserve">RMSEA 90% CI</w:t>
+                  </w:r>
+                </w:p>
+              </w:tc>
+              <w:tc>
+                <w:tcPr/>
+                <w:p>
+                  <w:pPr>
+                    <w:pStyle w:val="Compact"/>
+                    <w:jc w:val="right"/>
+                    <w:jc w:val="center"/>
+                  </w:pPr>
+                  <w:r>
+                    <w:t xml:space="preserve">SRMR</w:t>
+                  </w:r>
+                </w:p>
+              </w:tc>
+              <w:tc>
+                <w:tcPr/>
+                <w:p>
+                  <w:pPr>
+                    <w:pStyle w:val="Compact"/>
+                    <w:jc w:val="right"/>
+                    <w:jc w:val="center"/>
+                  </w:pPr>
+                  <w:r>
+                    <w:t xml:space="preserve">AIC</w:t>
+                  </w:r>
+                </w:p>
+              </w:tc>
+              <w:tc>
+                <w:tcPr/>
+                <w:p>
+                  <w:pPr>
+                    <w:pStyle w:val="Compact"/>
+                    <w:jc w:val="right"/>
+                    <w:jc w:val="center"/>
+                  </w:pPr>
+                  <w:r>
+                    <w:t xml:space="preserve">BIC</w:t>
+                  </w:r>
+                </w:p>
+              </w:tc>
+            </w:tr>
+            <w:tr>
+              <w:tc>
+                <w:tcPr/>
+                <w:p>
+                  <w:pPr>
+                    <w:pStyle w:val="Compact"/>
+                    <w:jc w:val="left"/>
+                    <w:jc w:val="center"/>
+                  </w:pPr>
+                  <w:r>
+                    <w:t xml:space="preserve">Serial chain</w:t>
+                  </w:r>
+                </w:p>
+              </w:tc>
+              <w:tc>
+                <w:tcPr/>
+                <w:p>
+                  <w:pPr>
+                    <w:pStyle w:val="Compact"/>
+                    <w:jc w:val="right"/>
+                    <w:jc w:val="center"/>
+                  </w:pPr>
+                  <w:r>
+                    <w:t xml:space="preserve">748.42</w:t>
+                  </w:r>
+                </w:p>
+              </w:tc>
+              <w:tc>
+                <w:tcPr/>
+                <w:p>
+                  <w:pPr>
+                    <w:pStyle w:val="Compact"/>
+                    <w:jc w:val="right"/>
+                    <w:jc w:val="center"/>
+                  </w:pPr>
+                  <w:r>
+                    <w:t xml:space="preserve">238</w:t>
+                  </w:r>
+                </w:p>
+              </w:tc>
+              <w:tc>
+                <w:tcPr/>
+                <w:p>
+                  <w:pPr>
+                    <w:pStyle w:val="Compact"/>
+                    <w:jc w:val="right"/>
+                    <w:jc w:val="center"/>
+                  </w:pPr>
+                  <w:r>
+                    <w:t xml:space="preserve">0.863</w:t>
+                  </w:r>
+                </w:p>
+              </w:tc>
+              <w:tc>
+                <w:tcPr/>
+                <w:p>
+                  <w:pPr>
+                    <w:pStyle w:val="Compact"/>
+                    <w:jc w:val="right"/>
+                    <w:jc w:val="center"/>
+                  </w:pPr>
+                  <w:r>
+                    <w:t xml:space="preserve">0.833</w:t>
+                  </w:r>
+                </w:p>
+              </w:tc>
+              <w:tc>
+                <w:tcPr/>
+                <w:p>
+                  <w:pPr>
+                    <w:pStyle w:val="Compact"/>
+                    <w:jc w:val="right"/>
+                    <w:jc w:val="center"/>
+                  </w:pPr>
+                  <w:r>
+                    <w:t xml:space="preserve">0.065</w:t>
+                  </w:r>
+                </w:p>
+              </w:tc>
+              <w:tc>
+                <w:tcPr/>
+                <w:p>
+                  <w:pPr>
+                    <w:pStyle w:val="Compact"/>
+                    <w:jc w:val="right"/>
+                    <w:jc w:val="center"/>
+                  </w:pPr>
+                  <w:r>
+                    <w:t xml:space="preserve">[0.060, 0.071]</w:t>
+                  </w:r>
+                </w:p>
+              </w:tc>
+              <w:tc>
+                <w:tcPr/>
+                <w:p>
+                  <w:pPr>
+                    <w:pStyle w:val="Compact"/>
+                    <w:jc w:val="right"/>
+                    <w:jc w:val="center"/>
+                  </w:pPr>
+                  <w:r>
+                    <w:t xml:space="preserve">0.085</w:t>
+                  </w:r>
+                </w:p>
+              </w:tc>
+              <w:tc>
+                <w:tcPr/>
+                <w:p>
+                  <w:pPr>
+                    <w:pStyle w:val="Compact"/>
+                    <w:jc w:val="right"/>
+                    <w:jc w:val="center"/>
+                  </w:pPr>
+                  <w:r>
+                    <w:t xml:space="preserve">25523.7</w:t>
+                  </w:r>
+                </w:p>
+              </w:tc>
+              <w:tc>
+                <w:tcPr/>
+                <w:p>
+                  <w:pPr>
+                    <w:pStyle w:val="Compact"/>
+                    <w:jc w:val="right"/>
+                    <w:jc w:val="center"/>
+                  </w:pPr>
+                  <w:r>
+                    <w:t xml:space="preserve">25827.3</w:t>
+                  </w:r>
+                </w:p>
+              </w:tc>
+            </w:tr>
+            <w:tr>
+              <w:tc>
+                <w:tcPr/>
+                <w:p>
+                  <w:pPr>
+                    <w:pStyle w:val="Compact"/>
+                    <w:jc w:val="left"/>
+                    <w:jc w:val="center"/>
+                  </w:pPr>
+                  <w:r>
+                    <w:t xml:space="preserve">Full (+ direct paths)</w:t>
+                  </w:r>
+                </w:p>
+              </w:tc>
+              <w:tc>
+                <w:tcPr/>
+                <w:p>
+                  <w:pPr>
+                    <w:pStyle w:val="Compact"/>
+                    <w:jc w:val="right"/>
+                    <w:jc w:val="center"/>
+                  </w:pPr>
+                  <w:r>
+                    <w:t xml:space="preserve">680.38</w:t>
+                  </w:r>
+                </w:p>
+              </w:tc>
+              <w:tc>
+                <w:tcPr/>
+                <w:p>
+                  <w:pPr>
+                    <w:pStyle w:val="Compact"/>
+                    <w:jc w:val="right"/>
+                    <w:jc w:val="center"/>
+                  </w:pPr>
+                  <w:r>
+                    <w:t xml:space="preserve">224</w:t>
+                  </w:r>
+                </w:p>
+              </w:tc>
+              <w:tc>
+                <w:tcPr/>
+                <w:p>
+                  <w:pPr>
+                    <w:pStyle w:val="Compact"/>
+                    <w:jc w:val="right"/>
+                    <w:jc w:val="center"/>
+                  </w:pPr>
+                  <w:r>
+                    <w:t xml:space="preserve">0.877</w:t>
+                  </w:r>
+                </w:p>
+              </w:tc>
+              <w:tc>
+                <w:tcPr/>
+                <w:p>
+                  <w:pPr>
+                    <w:pStyle w:val="Compact"/>
+                    <w:jc w:val="right"/>
+                    <w:jc w:val="center"/>
+                  </w:pPr>
+                  <w:r>
+                    <w:t xml:space="preserve">0.841</w:t>
+                  </w:r>
+                </w:p>
+              </w:tc>
+              <w:tc>
+                <w:tcPr/>
+                <w:p>
+                  <w:pPr>
+                    <w:pStyle w:val="Compact"/>
+                    <w:jc w:val="right"/>
+                    <w:jc w:val="center"/>
+                  </w:pPr>
+                  <w:r>
+                    <w:t xml:space="preserve">0.064</w:t>
+                  </w:r>
+                </w:p>
+              </w:tc>
+              <w:tc>
+                <w:tcPr/>
+                <w:p>
+                  <w:pPr>
+                    <w:pStyle w:val="Compact"/>
+                    <w:jc w:val="right"/>
+                    <w:jc w:val="center"/>
+                  </w:pPr>
+                  <w:r>
+                    <w:t xml:space="preserve">[0.058, 0.069]</w:t>
+                  </w:r>
+                </w:p>
+              </w:tc>
+              <w:tc>
+                <w:tcPr/>
+                <w:p>
+                  <w:pPr>
+                    <w:pStyle w:val="Compact"/>
+                    <w:jc w:val="right"/>
+                    <w:jc w:val="center"/>
+                  </w:pPr>
+                  <w:r>
+                    <w:t xml:space="preserve">0.081</w:t>
+                  </w:r>
+                </w:p>
+              </w:tc>
+              <w:tc>
+                <w:tcPr/>
+                <w:p>
+                  <w:pPr>
+                    <w:pStyle w:val="Compact"/>
+                    <w:jc w:val="right"/>
+                    <w:jc w:val="center"/>
+                  </w:pPr>
+                  <w:r>
+                    <w:t xml:space="preserve">25483.6</w:t>
+                  </w:r>
+                </w:p>
+              </w:tc>
+              <w:tc>
+                <w:tcPr/>
+                <w:p>
+                  <w:pPr>
+                    <w:pStyle w:val="Compact"/>
+                    <w:jc w:val="right"/>
+                    <w:jc w:val="center"/>
+                  </w:pPr>
+                  <w:r>
+                    <w:t xml:space="preserve">25846.3</w:t>
+                  </w:r>
+                </w:p>
+              </w:tc>
+            </w:tr>
+          </w:tbl>
+          <w:bookmarkEnd w:id="40"/>
+          <w:p/>
+        </w:tc>
+      </w:tr>
+    </w:tbl>
+    <w:p>
+      <w:pPr>
+        <w:pStyle w:val="BodyText"/>
+      </w:pPr>
+      <w:r>
+        <w:t xml:space="preserve">Nested</w:t>
+      </w:r>
+      <w:r>
+        <w:t xml:space="preserve"> </w:t>
+      </w:r>
+      <m:oMath>
+        <m:sSup>
+          <m:e>
+            <m:r>
+              <m:t>χ</m:t>
+            </m:r>
+          </m:e>
+          <m:sup>
+            <m:r>
+              <m:t>2</m:t>
+            </m:r>
+          </m:sup>
+        </m:sSup>
+      </m:oMath>
+      <w:r>
+        <w:t xml:space="preserve"> </w:t>
+      </w:r>
+      <w:r>
+        <w:t xml:space="preserve">difference test (serial chain nested in full model):</w:t>
+      </w:r>
+      <w:r>
+        <w:t xml:space="preserve"> </w:t>
+      </w:r>
+      <m:oMath>
+        <m:r>
+          <m:rPr>
+            <m:sty m:val="p"/>
+          </m:rPr>
+          <m:t>Δ</m:t>
+        </m:r>
+        <m:sSup>
+          <m:e>
+            <m:r>
+              <m:t>χ</m:t>
+            </m:r>
+          </m:e>
+          <m:sup>
+            <m:r>
+              <m:t>2</m:t>
+            </m:r>
+          </m:sup>
+        </m:sSup>
+        <m:r>
+          <m:rPr>
+            <m:sty m:val="p"/>
+          </m:rPr>
+          <m:t>(</m:t>
+        </m:r>
+        <m:r>
+          <m:t>14</m:t>
+        </m:r>
+        <m:r>
+          <m:rPr>
+            <m:sty m:val="p"/>
+          </m:rPr>
+          <m:t>)</m:t>
+        </m:r>
+        <m:r>
+          <m:rPr>
+            <m:sty m:val="p"/>
+          </m:rPr>
+          <m:t>=</m:t>
+        </m:r>
+        <m:r>
+          <m:t>68.04</m:t>
+        </m:r>
+      </m:oMath>
+      <w:r>
+        <w:t xml:space="preserve">,</w:t>
+      </w:r>
+      <w:r>
+        <w:t xml:space="preserve"> </w:t>
+      </w:r>
+      <m:oMath>
+        <m:r>
+          <m:t>p</m:t>
+        </m:r>
+        <m:r>
+          <m:rPr>
+            <m:sty m:val="p"/>
+          </m:rPr>
+          <m:t>=</m:t>
+        </m:r>
+        <m:r>
+          <m:t>0.0000</m:t>
+        </m:r>
+      </m:oMath>
+      <w:r>
+        <w:t xml:space="preserve">. The direct paths jointly improve fit.</w:t>
+      </w:r>
+    </w:p>
+    <w:tbl>
+      <w:tblPr>
+        <w:tblStyle w:val="Table"/>
+        <w:tblW w:type="pct" w:w="5000"/>
+        <w:tblLayout w:type="fixed"/>
+        <w:tblLook w:firstRow="0" w:lastRow="0" w:firstColumn="0" w:lastColumn="0" w:noHBand="0" w:noVBand="0" w:val="0000"/>
+      </w:tblPr>
+      <w:tblGrid>
+        <w:gridCol w:w="7920"/>
+      </w:tblGrid>
+      <w:tr>
+        <w:tc>
+          <w:tcPr/>
+          <w:bookmarkStart w:id="41" w:name="tbl-serial-effects-4wv"/>
+          <w:p>
+            <w:pPr>
+              <w:jc w:val="center"/>
+            </w:pPr>
+            <w:pPr>
+              <w:jc w:val="left"/>
+              <w:spacing w:before="200"/>
+              <w:pStyle w:val="ImageCaption"/>
+            </w:pPr>
+            <w:r>
+              <w:t xml:space="preserve">Table 3: Standardized decomposition of cultural cognition effects on public and private behavior in the full combined model, four separate worldview measures, controlling for age, gender, race, education, and household income († p&lt;0.10, * p&lt;0.05, ** p&lt;0.01, *** p&lt;0.001)</w:t>
+            </w:r>
+          </w:p>
+          <w:tbl>
+            <w:tblPr>
+              <w:tblStyle w:val="Table"/>
+              <w:tblW w:type="pct" w:w="5000"/>
+              <w:tblLayout w:type="fixed"/>
+              <w:tblLook w:firstRow="1" w:lastRow="0" w:firstColumn="0" w:lastColumn="0" w:noHBand="0" w:noVBand="0" w:val="0020"/>
+            </w:tblPr>
+            <w:tblGrid>
+              <w:gridCol w:w="1819"/>
+              <w:gridCol w:w="856"/>
+              <w:gridCol w:w="856"/>
+              <w:gridCol w:w="1819"/>
+              <w:gridCol w:w="1605"/>
+              <w:gridCol w:w="963"/>
+            </w:tblGrid>
+            <w:tr>
+              <w:trPr>
+                <w:tblHeader w:val="on"/>
+              </w:trPr>
+              <w:tc>
+                <w:tcPr/>
+                <w:p>
+                  <w:pPr>
+                    <w:pStyle w:val="Compact"/>
+                    <w:jc w:val="left"/>
+                    <w:jc w:val="center"/>
+                  </w:pPr>
+                  <w:r>
+                    <w:t xml:space="preserve">Predictor</w:t>
+                  </w:r>
+                </w:p>
+              </w:tc>
+              <w:tc>
+                <w:tcPr/>
+                <w:p>
+                  <w:pPr>
+                    <w:pStyle w:val="Compact"/>
+                    <w:jc w:val="left"/>
+                    <w:jc w:val="center"/>
+                  </w:pPr>
+                  <w:r>
+                    <w:t xml:space="preserve">Outcome</w:t>
+                  </w:r>
+                </w:p>
+              </w:tc>
+              <w:tc>
+                <w:tcPr/>
+                <w:p>
+                  <w:pPr>
+                    <w:pStyle w:val="Compact"/>
+                    <w:jc w:val="right"/>
+                    <w:jc w:val="center"/>
+                  </w:pPr>
+                  <w:r>
+                    <w:t xml:space="preserve">Direct</w:t>
+                  </w:r>
+                </w:p>
+              </w:tc>
+              <w:tc>
+                <w:tcPr/>
+                <w:p>
+                  <w:pPr>
+                    <w:pStyle w:val="Compact"/>
+                    <w:jc w:val="right"/>
+                    <w:jc w:val="center"/>
+                  </w:pPr>
+                  <w:r>
+                    <w:t xml:space="preserve">Serial (NEP→CNS)</w:t>
+                  </w:r>
+                </w:p>
+              </w:tc>
+              <w:tc>
+                <w:tcPr/>
+                <w:p>
+                  <w:pPr>
+                    <w:pStyle w:val="Compact"/>
+                    <w:jc w:val="right"/>
+                    <w:jc w:val="center"/>
+                  </w:pPr>
+                  <w:r>
+                    <w:t xml:space="preserve">Total indirect</w:t>
+                  </w:r>
+                </w:p>
+              </w:tc>
+              <w:tc>
+                <w:tcPr/>
+                <w:p>
+                  <w:pPr>
+                    <w:pStyle w:val="Compact"/>
+                    <w:jc w:val="right"/>
+                    <w:jc w:val="center"/>
+                  </w:pPr>
+                  <w:r>
+                    <w:t xml:space="preserve">Total</w:t>
+                  </w:r>
+                </w:p>
+              </w:tc>
+            </w:tr>
+            <w:tr>
+              <w:tc>
+                <w:tcPr/>
+                <w:p>
+                  <w:pPr>
+                    <w:pStyle w:val="Compact"/>
+                    <w:jc w:val="left"/>
+                    <w:jc w:val="center"/>
+                  </w:pPr>
+                  <w:r>
+                    <w:t xml:space="preserve">Egalitarianism</w:t>
+                  </w:r>
+                </w:p>
+              </w:tc>
+              <w:tc>
+                <w:tcPr/>
+                <w:p>
+                  <w:pPr>
+                    <w:pStyle w:val="Compact"/>
+                    <w:jc w:val="left"/>
+                    <w:jc w:val="center"/>
+                  </w:pPr>
+                  <w:r>
+                    <w:t xml:space="preserve">Public</w:t>
+                  </w:r>
+                </w:p>
+              </w:tc>
+              <w:tc>
+                <w:tcPr/>
+                <w:p>
+                  <w:pPr>
+                    <w:pStyle w:val="Compact"/>
+                    <w:jc w:val="right"/>
+                    <w:jc w:val="center"/>
+                  </w:pPr>
+                  <w:r>
+                    <w:t xml:space="preserve">0.213*</w:t>
+                  </w:r>
+                </w:p>
+              </w:tc>
+              <w:tc>
+                <w:tcPr/>
+                <w:p>
+                  <w:pPr>
+                    <w:pStyle w:val="Compact"/>
+                    <w:jc w:val="right"/>
+                    <w:jc w:val="center"/>
+                  </w:pPr>
+                  <w:r>
+                    <w:t xml:space="preserve">0.057*</w:t>
+                  </w:r>
+                </w:p>
+              </w:tc>
+              <w:tc>
+                <w:tcPr/>
+                <w:p>
+                  <w:pPr>
+                    <w:pStyle w:val="Compact"/>
+                    <w:jc w:val="right"/>
+                    <w:jc w:val="center"/>
+                  </w:pPr>
+                  <w:r>
+                    <w:t xml:space="preserve">0.176**</w:t>
+                  </w:r>
+                </w:p>
+              </w:tc>
+              <w:tc>
+                <w:tcPr/>
+                <w:p>
+                  <w:pPr>
+                    <w:pStyle w:val="Compact"/>
+                    <w:jc w:val="right"/>
+                    <w:jc w:val="center"/>
+                  </w:pPr>
+                  <w:r>
+                    <w:t xml:space="preserve">0.389***</w:t>
+                  </w:r>
+                </w:p>
+              </w:tc>
+            </w:tr>
+            <w:tr>
+              <w:tc>
+                <w:tcPr/>
+                <w:p>
+                  <w:pPr>
+                    <w:pStyle w:val="Compact"/>
+                    <w:jc w:val="left"/>
+                    <w:jc w:val="center"/>
+                  </w:pPr>
+                  <w:r>
+                    <w:t xml:space="preserve">Egalitarianism</w:t>
+                  </w:r>
+                </w:p>
+              </w:tc>
+              <w:tc>
+                <w:tcPr/>
+                <w:p>
+                  <w:pPr>
+                    <w:pStyle w:val="Compact"/>
+                    <w:jc w:val="left"/>
+                    <w:jc w:val="center"/>
+                  </w:pPr>
+                  <w:r>
+                    <w:t xml:space="preserve">Private</w:t>
+                  </w:r>
+                </w:p>
+              </w:tc>
+              <w:tc>
+                <w:tcPr/>
+                <w:p>
+                  <w:pPr>
+                    <w:pStyle w:val="Compact"/>
+                    <w:jc w:val="right"/>
+                    <w:jc w:val="center"/>
+                  </w:pPr>
+                  <w:r>
+                    <w:t xml:space="preserve">-0.023</w:t>
+                  </w:r>
+                </w:p>
+              </w:tc>
+              <w:tc>
+                <w:tcPr/>
+                <w:p>
+                  <w:pPr>
+                    <w:pStyle w:val="Compact"/>
+                    <w:jc w:val="right"/>
+                    <w:jc w:val="center"/>
+                  </w:pPr>
+                  <w:r>
+                    <w:t xml:space="preserve">0.071**</w:t>
+                  </w:r>
+                </w:p>
+              </w:tc>
+              <w:tc>
+                <w:tcPr/>
+                <w:p>
+                  <w:pPr>
+                    <w:pStyle w:val="Compact"/>
+                    <w:jc w:val="right"/>
+                    <w:jc w:val="center"/>
+                  </w:pPr>
+                  <w:r>
+                    <w:t xml:space="preserve">0.220***</w:t>
+                  </w:r>
+                </w:p>
+              </w:tc>
+              <w:tc>
+                <w:tcPr/>
+                <w:p>
+                  <w:pPr>
+                    <w:pStyle w:val="Compact"/>
+                    <w:jc w:val="right"/>
+                    <w:jc w:val="center"/>
+                  </w:pPr>
+                  <w:r>
+                    <w:t xml:space="preserve">0.197**</w:t>
+                  </w:r>
+                </w:p>
+              </w:tc>
+            </w:tr>
+            <w:tr>
+              <w:tc>
+                <w:tcPr/>
+                <w:p>
+                  <w:pPr>
+                    <w:pStyle w:val="Compact"/>
+                    <w:jc w:val="left"/>
+                    <w:jc w:val="center"/>
+                  </w:pPr>
+                  <w:r>
+                    <w:t xml:space="preserve">Communitarianism</w:t>
+                  </w:r>
+                </w:p>
+              </w:tc>
+              <w:tc>
+                <w:tcPr/>
+                <w:p>
+                  <w:pPr>
+                    <w:pStyle w:val="Compact"/>
+                    <w:jc w:val="left"/>
+                    <w:jc w:val="center"/>
+                  </w:pPr>
+                  <w:r>
+                    <w:t xml:space="preserve">Public</w:t>
+                  </w:r>
+                </w:p>
+              </w:tc>
+              <w:tc>
+                <w:tcPr/>
+                <w:p>
+                  <w:pPr>
+                    <w:pStyle w:val="Compact"/>
+                    <w:jc w:val="right"/>
+                    <w:jc w:val="center"/>
+                  </w:pPr>
+                  <w:r>
+                    <w:t xml:space="preserve">0.058</w:t>
+                  </w:r>
+                </w:p>
+              </w:tc>
+              <w:tc>
+                <w:tcPr/>
+                <w:p>
+                  <w:pPr>
+                    <w:pStyle w:val="Compact"/>
+                    <w:jc w:val="right"/>
+                    <w:jc w:val="center"/>
+                  </w:pPr>
+                  <w:r>
+                    <w:t xml:space="preserve">0.008</w:t>
+                  </w:r>
+                </w:p>
+              </w:tc>
+              <w:tc>
+                <w:tcPr/>
+                <w:p>
+                  <w:pPr>
+                    <w:pStyle w:val="Compact"/>
+                    <w:jc w:val="right"/>
+                    <w:jc w:val="center"/>
+                  </w:pPr>
+                  <w:r>
+                    <w:t xml:space="preserve">0.076**</w:t>
+                  </w:r>
+                </w:p>
+              </w:tc>
+              <w:tc>
+                <w:tcPr/>
+                <w:p>
+                  <w:pPr>
+                    <w:pStyle w:val="Compact"/>
+                    <w:jc w:val="right"/>
+                    <w:jc w:val="center"/>
+                  </w:pPr>
+                  <w:r>
+                    <w:t xml:space="preserve">0.134*</w:t>
+                  </w:r>
+                </w:p>
+              </w:tc>
+            </w:tr>
+            <w:tr>
+              <w:tc>
+                <w:tcPr/>
+                <w:p>
+                  <w:pPr>
+                    <w:pStyle w:val="Compact"/>
+                    <w:jc w:val="left"/>
+                    <w:jc w:val="center"/>
+                  </w:pPr>
+                  <w:r>
+                    <w:t xml:space="preserve">Communitarianism</w:t>
+                  </w:r>
+                </w:p>
+              </w:tc>
+              <w:tc>
+                <w:tcPr/>
+                <w:p>
+                  <w:pPr>
+                    <w:pStyle w:val="Compact"/>
+                    <w:jc w:val="left"/>
+                    <w:jc w:val="center"/>
+                  </w:pPr>
+                  <w:r>
+                    <w:t xml:space="preserve">Private</w:t>
+                  </w:r>
+                </w:p>
+              </w:tc>
+              <w:tc>
+                <w:tcPr/>
+                <w:p>
+                  <w:pPr>
+                    <w:pStyle w:val="Compact"/>
+                    <w:jc w:val="right"/>
+                    <w:jc w:val="center"/>
+                  </w:pPr>
+                  <w:r>
+                    <w:t xml:space="preserve">-0.141*</w:t>
+                  </w:r>
+                </w:p>
+              </w:tc>
+              <w:tc>
+                <w:tcPr/>
+                <w:p>
+                  <w:pPr>
+                    <w:pStyle w:val="Compact"/>
+                    <w:jc w:val="right"/>
+                    <w:jc w:val="center"/>
+                  </w:pPr>
+                  <w:r>
+                    <w:t xml:space="preserve">0.010</w:t>
+                  </w:r>
+                </w:p>
+              </w:tc>
+              <w:tc>
+                <w:tcPr/>
+                <w:p>
+                  <w:pPr>
+                    <w:pStyle w:val="Compact"/>
+                    <w:jc w:val="right"/>
+                    <w:jc w:val="center"/>
+                  </w:pPr>
+                  <w:r>
+                    <w:t xml:space="preserve">0.095**</w:t>
+                  </w:r>
+                </w:p>
+              </w:tc>
+              <w:tc>
+                <w:tcPr/>
+                <w:p>
+                  <w:pPr>
+                    <w:pStyle w:val="Compact"/>
+                    <w:jc w:val="right"/>
+                    <w:jc w:val="center"/>
+                  </w:pPr>
+                  <w:r>
+                    <w:t xml:space="preserve">-0.046</w:t>
+                  </w:r>
+                </w:p>
+              </w:tc>
+            </w:tr>
+            <w:tr>
+              <w:tc>
+                <w:tcPr/>
+                <w:p>
+                  <w:pPr>
+                    <w:pStyle w:val="Compact"/>
+                    <w:jc w:val="left"/>
+                    <w:jc w:val="center"/>
+                  </w:pPr>
+                  <w:r>
+                    <w:t xml:space="preserve">Hierarchy</w:t>
+                  </w:r>
+                </w:p>
+              </w:tc>
+              <w:tc>
+                <w:tcPr/>
+                <w:p>
+                  <w:pPr>
+                    <w:pStyle w:val="Compact"/>
+                    <w:jc w:val="left"/>
+                    <w:jc w:val="center"/>
+                  </w:pPr>
+                  <w:r>
+                    <w:t xml:space="preserve">Public</w:t>
+                  </w:r>
+                </w:p>
+              </w:tc>
+              <w:tc>
+                <w:tcPr/>
+                <w:p>
+                  <w:pPr>
+                    <w:pStyle w:val="Compact"/>
+                    <w:jc w:val="right"/>
+                    <w:jc w:val="center"/>
+                  </w:pPr>
+                  <w:r>
+                    <w:t xml:space="preserve">0.171†</w:t>
+                  </w:r>
+                </w:p>
+              </w:tc>
+              <w:tc>
+                <w:tcPr/>
+                <w:p>
+                  <w:pPr>
+                    <w:pStyle w:val="Compact"/>
+                    <w:jc w:val="right"/>
+                    <w:jc w:val="center"/>
+                  </w:pPr>
+                  <w:r>
+                    <w:t xml:space="preserve">-0.016</w:t>
+                  </w:r>
+                </w:p>
+              </w:tc>
+              <w:tc>
+                <w:tcPr/>
+                <w:p>
+                  <w:pPr>
+                    <w:pStyle w:val="Compact"/>
+                    <w:jc w:val="right"/>
+                    <w:jc w:val="center"/>
+                  </w:pPr>
+                  <w:r>
+                    <w:t xml:space="preserve">-0.093*</w:t>
+                  </w:r>
+                </w:p>
+              </w:tc>
+              <w:tc>
+                <w:tcPr/>
+                <w:p>
+                  <w:pPr>
+                    <w:pStyle w:val="Compact"/>
+                    <w:jc w:val="right"/>
+                    <w:jc w:val="center"/>
+                  </w:pPr>
+                  <w:r>
+                    <w:t xml:space="preserve">0.078</w:t>
+                  </w:r>
+                </w:p>
+              </w:tc>
+            </w:tr>
+            <w:tr>
+              <w:tc>
+                <w:tcPr/>
+                <w:p>
+                  <w:pPr>
+                    <w:pStyle w:val="Compact"/>
+                    <w:jc w:val="left"/>
+                    <w:jc w:val="center"/>
+                  </w:pPr>
+                  <w:r>
+                    <w:t xml:space="preserve">Hierarchy</w:t>
+                  </w:r>
+                </w:p>
+              </w:tc>
+              <w:tc>
+                <w:tcPr/>
+                <w:p>
+                  <w:pPr>
+                    <w:pStyle w:val="Compact"/>
+                    <w:jc w:val="left"/>
+                    <w:jc w:val="center"/>
+                  </w:pPr>
+                  <w:r>
+                    <w:t xml:space="preserve">Private</w:t>
+                  </w:r>
+                </w:p>
+              </w:tc>
+              <w:tc>
+                <w:tcPr/>
+                <w:p>
+                  <w:pPr>
+                    <w:pStyle w:val="Compact"/>
+                    <w:jc w:val="right"/>
+                    <w:jc w:val="center"/>
+                  </w:pPr>
+                  <w:r>
+                    <w:t xml:space="preserve">-0.066</w:t>
+                  </w:r>
+                </w:p>
+              </w:tc>
+              <w:tc>
+                <w:tcPr/>
+                <w:p>
+                  <w:pPr>
+                    <w:pStyle w:val="Compact"/>
+                    <w:jc w:val="right"/>
+                    <w:jc w:val="center"/>
+                  </w:pPr>
+                  <w:r>
+                    <w:t xml:space="preserve">-0.020</w:t>
+                  </w:r>
+                </w:p>
+              </w:tc>
+              <w:tc>
+                <w:tcPr/>
+                <w:p>
+                  <w:pPr>
+                    <w:pStyle w:val="Compact"/>
+                    <w:jc w:val="right"/>
+                    <w:jc w:val="center"/>
+                  </w:pPr>
+                  <w:r>
+                    <w:t xml:space="preserve">-0.116*</w:t>
+                  </w:r>
+                </w:p>
+              </w:tc>
+              <w:tc>
+                <w:tcPr/>
+                <w:p>
+                  <w:pPr>
+                    <w:pStyle w:val="Compact"/>
+                    <w:jc w:val="right"/>
+                    <w:jc w:val="center"/>
+                  </w:pPr>
+                  <w:r>
+                    <w:t xml:space="preserve">-0.182†</w:t>
+                  </w:r>
+                </w:p>
+              </w:tc>
+            </w:tr>
+            <w:tr>
+              <w:tc>
+                <w:tcPr/>
+                <w:p>
+                  <w:pPr>
+                    <w:pStyle w:val="Compact"/>
+                    <w:jc w:val="left"/>
+                    <w:jc w:val="center"/>
+                  </w:pPr>
+                  <w:r>
+                    <w:t xml:space="preserve">Individualism</w:t>
+                  </w:r>
+                </w:p>
+              </w:tc>
+              <w:tc>
+                <w:tcPr/>
+                <w:p>
+                  <w:pPr>
+                    <w:pStyle w:val="Compact"/>
+                    <w:jc w:val="left"/>
+                    <w:jc w:val="center"/>
+                  </w:pPr>
+                  <w:r>
+                    <w:t xml:space="preserve">Public</w:t>
+                  </w:r>
+                </w:p>
+              </w:tc>
+              <w:tc>
+                <w:tcPr/>
+                <w:p>
+                  <w:pPr>
+                    <w:pStyle w:val="Compact"/>
+                    <w:jc w:val="right"/>
+                    <w:jc w:val="center"/>
+                  </w:pPr>
+                  <w:r>
+                    <w:t xml:space="preserve">0.047</w:t>
+                  </w:r>
+                </w:p>
+              </w:tc>
+              <w:tc>
+                <w:tcPr/>
+                <w:p>
+                  <w:pPr>
+                    <w:pStyle w:val="Compact"/>
+                    <w:jc w:val="right"/>
+                    <w:jc w:val="center"/>
+                  </w:pPr>
+                  <w:r>
+                    <w:t xml:space="preserve">-0.009</w:t>
+                  </w:r>
+                </w:p>
+              </w:tc>
+              <w:tc>
+                <w:tcPr/>
+                <w:p>
+                  <w:pPr>
+                    <w:pStyle w:val="Compact"/>
+                    <w:jc w:val="right"/>
+                    <w:jc w:val="center"/>
+                  </w:pPr>
+                  <w:r>
+                    <w:t xml:space="preserve">0.038</w:t>
+                  </w:r>
+                </w:p>
+              </w:tc>
+              <w:tc>
+                <w:tcPr/>
+                <w:p>
+                  <w:pPr>
+                    <w:pStyle w:val="Compact"/>
+                    <w:jc w:val="right"/>
+                    <w:jc w:val="center"/>
+                  </w:pPr>
+                  <w:r>
+                    <w:t xml:space="preserve">0.086</w:t>
+                  </w:r>
+                </w:p>
+              </w:tc>
+            </w:tr>
+            <w:tr>
+              <w:tc>
+                <w:tcPr/>
+                <w:p>
+                  <w:pPr>
+                    <w:pStyle w:val="Compact"/>
+                    <w:jc w:val="left"/>
+                    <w:jc w:val="center"/>
+                  </w:pPr>
+                  <w:r>
+                    <w:t xml:space="preserve">Individualism</w:t>
+                  </w:r>
+                </w:p>
+              </w:tc>
+              <w:tc>
+                <w:tcPr/>
+                <w:p>
+                  <w:pPr>
+                    <w:pStyle w:val="Compact"/>
+                    <w:jc w:val="left"/>
+                    <w:jc w:val="center"/>
+                  </w:pPr>
+                  <w:r>
+                    <w:t xml:space="preserve">Private</w:t>
+                  </w:r>
+                </w:p>
+              </w:tc>
+              <w:tc>
+                <w:tcPr/>
+                <w:p>
+                  <w:pPr>
+                    <w:pStyle w:val="Compact"/>
+                    <w:jc w:val="right"/>
+                    <w:jc w:val="center"/>
+                  </w:pPr>
+                  <w:r>
+                    <w:t xml:space="preserve">-0.018</w:t>
+                  </w:r>
+                </w:p>
+              </w:tc>
+              <w:tc>
+                <w:tcPr/>
+                <w:p>
+                  <w:pPr>
+                    <w:pStyle w:val="Compact"/>
+                    <w:jc w:val="right"/>
+                    <w:jc w:val="center"/>
+                  </w:pPr>
+                  <w:r>
+                    <w:t xml:space="preserve">-0.011</w:t>
+                  </w:r>
+                </w:p>
+              </w:tc>
+              <w:tc>
+                <w:tcPr/>
+                <w:p>
+                  <w:pPr>
+                    <w:pStyle w:val="Compact"/>
+                    <w:jc w:val="right"/>
+                    <w:jc w:val="center"/>
+                  </w:pPr>
+                  <w:r>
+                    <w:t xml:space="preserve">0.048</w:t>
+                  </w:r>
+                </w:p>
+              </w:tc>
+              <w:tc>
+                <w:tcPr/>
+                <w:p>
+                  <w:pPr>
+                    <w:pStyle w:val="Compact"/>
+                    <w:jc w:val="right"/>
+                    <w:jc w:val="center"/>
+                  </w:pPr>
+                  <w:r>
+                    <w:t xml:space="preserve">0.029</w:t>
+                  </w:r>
+                </w:p>
+              </w:tc>
+            </w:tr>
+          </w:tbl>
+          <w:bookmarkEnd w:id="41"/>
+          <w:p/>
+        </w:tc>
+      </w:tr>
+    </w:tbl>
+    <w:bookmarkEnd w:id="42"/>
+    <w:bookmarkStart w:id="47" w:name="X6ae8f49109075555e434b86493e1683070a13c8"/>
+    <w:p>
+      <w:pPr>
+        <w:pStyle w:val="Heading1"/>
+      </w:pPr>
+      <w:r>
+        <w:t xml:space="preserve">Full combined model with measurement detail</w:t>
+      </w:r>
+    </w:p>
+    <w:p>
+      <w:pPr>
+        <w:pStyle w:val="FirstParagraph"/>
+      </w:pPr>
+      <w:r>
+        <w:t xml:space="preserve">Figure S4 shows the same four-worldview-measure full combined model with the full measurement model — the latent constructs and their indicators — included.</w:t>
+      </w:r>
+    </w:p>
+    <w:tbl>
+      <w:tblPr>
+        <w:tblStyle w:val="Table"/>
+        <w:tblW w:type="pct" w:w="5000"/>
+        <w:tblLayout w:type="fixed"/>
+        <w:tblLook w:firstRow="0" w:lastRow="0" w:firstColumn="0" w:lastColumn="0" w:noHBand="0" w:noVBand="0" w:val="0000"/>
+      </w:tblPr>
+      <w:tblGrid>
+        <w:gridCol w:w="7920"/>
+      </w:tblGrid>
+      <w:tr>
+        <w:tc>
+          <w:tcPr/>
+          <w:bookmarkStart w:id="46" w:name="fig-serial"/>
+          <w:p>
+            <w:pPr>
+              <w:jc w:val="center"/>
+            </w:pPr>
+            <w:pPr>
+              <w:jc w:val="left"/>
+              <w:spacing w:before="200"/>
+              <w:pStyle w:val="ImageCaption"/>
+            </w:pPr>
+            <w:r>
+              <w:t xml:space="preserve">Figure 4: Full combined model including the measurement model (latent constructs and their indicators) and the structural paths: cultural cognition → New Ecological Paradigm → Connectedness to Nature → public and private pro-environmental behavior, with direct paths. Controlling for age, gender, race, education, and household income (paths not shown). Standardized coefficients shown; * p&lt;0.05, ** p&lt;0.01, *** p&lt;0.001.</w:t>
+            </w:r>
+          </w:p>
+          <w:p>
+            <w:pPr>
+              <w:pStyle w:val="Compact"/>
+              <w:jc w:val="center"/>
+            </w:pPr>
+            <w:r>
+              <w:drawing>
+                <wp:inline>
+                  <wp:extent cx="6642100" cy="4797072"/>
+                  <wp:effectExtent b="0" l="0" r="0" t="0"/>
+                  <wp:docPr descr="" title="" id="44" name="Picture"/>
+                  <a:graphic>
+                    <a:graphicData uri="http://schemas.openxmlformats.org/drawingml/2006/picture">
+                      <pic:pic>
+                        <pic:nvPicPr>
+                          <pic:cNvPr descr="cc-behave-supplemental_files/figure-docx/fig-serial-1.png" id="45" name="Picture"/>
+                          <pic:cNvPicPr>
+                            <a:picLocks noChangeArrowheads="1" noChangeAspect="1"/>
+                          </pic:cNvPicPr>
+                        </pic:nvPicPr>
+                        <pic:blipFill>
+                          <a:blip r:embed="rId43"/>
+                          <a:stretch>
+                            <a:fillRect/>
+                          </a:stretch>
+                        </pic:blipFill>
+                        <pic:spPr bwMode="auto">
+                          <a:xfrm>
+                            <a:off x="0" y="0"/>
+                            <a:ext cx="6642100" cy="4797072"/>
+                          </a:xfrm>
+                          <a:prstGeom prst="rect">
+                            <a:avLst/>
+                          </a:prstGeom>
+                          <a:noFill/>
+                          <a:ln w="9525">
+                            <a:noFill/>
+                            <a:headEnd/>
+                            <a:tailEnd/>
+                          </a:ln>
+                        </pic:spPr>
+                      </pic:pic>
+                    </a:graphicData>
+                  </a:graphic>
+                </wp:inline>
+              </w:drawing>
+            </w:r>
+          </w:p>
+          <w:bookmarkEnd w:id="46"/>
+        </w:tc>
+      </w:tr>
+    </w:tbl>
+    <w:bookmarkEnd w:id="47"/>
+    <w:bookmarkStart w:id="49" w:name="mediation-analysis"/>
     <w:p>
       <w:pPr>
         <w:pStyle w:val="Heading1"/>
@@ -757,7 +2135,7 @@
       <w:tr>
         <w:tc>
           <w:tcPr/>
-          <w:bookmarkStart w:id="41" w:name="tbl-mediation"/>
+          <w:bookmarkStart w:id="48" w:name="tbl-mediation"/>
           <w:p>
             <w:pPr>
               <w:jc w:val="center"/>
@@ -768,7 +2146,7 @@
               <w:pStyle w:val="ImageCaption"/>
             </w:pPr>
             <w:r>
-              <w:t xml:space="preserve">Table 2: Mediation analysis: standardized direct, indirect, and total effects of cultural cognition on public and private pro-environmental behavior († p&lt;0.10, * p&lt;0.05, ** p&lt;0.01, *** p&lt;0.001)</w:t>
+              <w:t xml:space="preserve">Table 4: Mediation analysis: standardized direct, indirect, and total effects of cultural cognition on public and private pro-environmental behavior, controlling for age, gender, race, education, and household income († p&lt;0.10, * p&lt;0.05, ** p&lt;0.01, *** p&lt;0.001)</w:t>
             </w:r>
           </w:p>
           <w:tbl>
@@ -890,33 +2268,33 @@
                     <w:jc w:val="center"/>
                   </w:pPr>
                   <w:r>
-                    <w:t xml:space="preserve">0.271***</w:t>
-                  </w:r>
-                </w:p>
-              </w:tc>
-              <w:tc>
-                <w:tcPr/>
-                <w:p>
-                  <w:pPr>
-                    <w:pStyle w:val="Compact"/>
-                    <w:jc w:val="right"/>
-                    <w:jc w:val="center"/>
-                  </w:pPr>
-                  <w:r>
-                    <w:t xml:space="preserve">0.085**</w:t>
-                  </w:r>
-                </w:p>
-              </w:tc>
-              <w:tc>
-                <w:tcPr/>
-                <w:p>
-                  <w:pPr>
-                    <w:pStyle w:val="Compact"/>
-                    <w:jc w:val="right"/>
-                    <w:jc w:val="center"/>
-                  </w:pPr>
-                  <w:r>
-                    <w:t xml:space="preserve">0.356***</w:t>
+                    <w:t xml:space="preserve">0.286***</w:t>
+                  </w:r>
+                </w:p>
+              </w:tc>
+              <w:tc>
+                <w:tcPr/>
+                <w:p>
+                  <w:pPr>
+                    <w:pStyle w:val="Compact"/>
+                    <w:jc w:val="right"/>
+                    <w:jc w:val="center"/>
+                  </w:pPr>
+                  <w:r>
+                    <w:t xml:space="preserve">0.099**</w:t>
+                  </w:r>
+                </w:p>
+              </w:tc>
+              <w:tc>
+                <w:tcPr/>
+                <w:p>
+                  <w:pPr>
+                    <w:pStyle w:val="Compact"/>
+                    <w:jc w:val="right"/>
+                    <w:jc w:val="center"/>
+                  </w:pPr>
+                  <w:r>
+                    <w:t xml:space="preserve">0.385***</w:t>
                   </w:r>
                 </w:p>
               </w:tc>
@@ -957,33 +2335,33 @@
                     <w:jc w:val="center"/>
                   </w:pPr>
                   <w:r>
-                    <w:t xml:space="preserve">0.017</w:t>
-                  </w:r>
-                </w:p>
-              </w:tc>
-              <w:tc>
-                <w:tcPr/>
-                <w:p>
-                  <w:pPr>
-                    <w:pStyle w:val="Compact"/>
-                    <w:jc w:val="right"/>
-                    <w:jc w:val="center"/>
-                  </w:pPr>
-                  <w:r>
-                    <w:t xml:space="preserve">0.120**</w:t>
-                  </w:r>
-                </w:p>
-              </w:tc>
-              <w:tc>
-                <w:tcPr/>
-                <w:p>
-                  <w:pPr>
-                    <w:pStyle w:val="Compact"/>
-                    <w:jc w:val="right"/>
-                    <w:jc w:val="center"/>
-                  </w:pPr>
-                  <w:r>
-                    <w:t xml:space="preserve">0.137†</w:t>
+                    <w:t xml:space="preserve">0.072</w:t>
+                  </w:r>
+                </w:p>
+              </w:tc>
+              <w:tc>
+                <w:tcPr/>
+                <w:p>
+                  <w:pPr>
+                    <w:pStyle w:val="Compact"/>
+                    <w:jc w:val="right"/>
+                    <w:jc w:val="center"/>
+                  </w:pPr>
+                  <w:r>
+                    <w:t xml:space="preserve">0.124**</w:t>
+                  </w:r>
+                </w:p>
+              </w:tc>
+              <w:tc>
+                <w:tcPr/>
+                <w:p>
+                  <w:pPr>
+                    <w:pStyle w:val="Compact"/>
+                    <w:jc w:val="right"/>
+                    <w:jc w:val="center"/>
+                  </w:pPr>
+                  <w:r>
+                    <w:t xml:space="preserve">0.197**</w:t>
                   </w:r>
                 </w:p>
               </w:tc>
@@ -1024,33 +2402,33 @@
                     <w:jc w:val="center"/>
                   </w:pPr>
                   <w:r>
-                    <w:t xml:space="preserve">0.128*</w:t>
-                  </w:r>
-                </w:p>
-              </w:tc>
-              <w:tc>
-                <w:tcPr/>
-                <w:p>
-                  <w:pPr>
-                    <w:pStyle w:val="Compact"/>
-                    <w:jc w:val="right"/>
-                    <w:jc w:val="center"/>
-                  </w:pPr>
-                  <w:r>
-                    <w:t xml:space="preserve">0.054*</w:t>
-                  </w:r>
-                </w:p>
-              </w:tc>
-              <w:tc>
-                <w:tcPr/>
-                <w:p>
-                  <w:pPr>
-                    <w:pStyle w:val="Compact"/>
-                    <w:jc w:val="right"/>
-                    <w:jc w:val="center"/>
-                  </w:pPr>
-                  <w:r>
-                    <w:t xml:space="preserve">0.182**</w:t>
+                    <w:t xml:space="preserve">0.065</w:t>
+                  </w:r>
+                </w:p>
+              </w:tc>
+              <w:tc>
+                <w:tcPr/>
+                <w:p>
+                  <w:pPr>
+                    <w:pStyle w:val="Compact"/>
+                    <w:jc w:val="right"/>
+                    <w:jc w:val="center"/>
+                  </w:pPr>
+                  <w:r>
+                    <w:t xml:space="preserve">0.071*</w:t>
+                  </w:r>
+                </w:p>
+              </w:tc>
+              <w:tc>
+                <w:tcPr/>
+                <w:p>
+                  <w:pPr>
+                    <w:pStyle w:val="Compact"/>
+                    <w:jc w:val="right"/>
+                    <w:jc w:val="center"/>
+                  </w:pPr>
+                  <w:r>
+                    <w:t xml:space="preserve">0.135*</w:t>
                   </w:r>
                 </w:p>
               </w:tc>
@@ -1091,33 +2469,33 @@
                     <w:jc w:val="center"/>
                   </w:pPr>
                   <w:r>
-                    <w:t xml:space="preserve">-0.159*</w:t>
-                  </w:r>
-                </w:p>
-              </w:tc>
-              <w:tc>
-                <w:tcPr/>
-                <w:p>
-                  <w:pPr>
-                    <w:pStyle w:val="Compact"/>
-                    <w:jc w:val="right"/>
-                    <w:jc w:val="center"/>
-                  </w:pPr>
-                  <w:r>
-                    <w:t xml:space="preserve">0.076*</w:t>
-                  </w:r>
-                </w:p>
-              </w:tc>
-              <w:tc>
-                <w:tcPr/>
-                <w:p>
-                  <w:pPr>
-                    <w:pStyle w:val="Compact"/>
-                    <w:jc w:val="right"/>
-                    <w:jc w:val="center"/>
-                  </w:pPr>
-                  <w:r>
-                    <w:t xml:space="preserve">-0.083</w:t>
+                    <w:t xml:space="preserve">-0.136*</w:t>
+                  </w:r>
+                </w:p>
+              </w:tc>
+              <w:tc>
+                <w:tcPr/>
+                <w:p>
+                  <w:pPr>
+                    <w:pStyle w:val="Compact"/>
+                    <w:jc w:val="right"/>
+                    <w:jc w:val="center"/>
+                  </w:pPr>
+                  <w:r>
+                    <w:t xml:space="preserve">0.089*</w:t>
+                  </w:r>
+                </w:p>
+              </w:tc>
+              <w:tc>
+                <w:tcPr/>
+                <w:p>
+                  <w:pPr>
+                    <w:pStyle w:val="Compact"/>
+                    <w:jc w:val="right"/>
+                    <w:jc w:val="center"/>
+                  </w:pPr>
+                  <w:r>
+                    <w:t xml:space="preserve">-0.047</w:t>
                   </w:r>
                 </w:p>
               </w:tc>
@@ -1158,33 +2536,33 @@
                     <w:jc w:val="center"/>
                   </w:pPr>
                   <w:r>
-                    <w:t xml:space="preserve">0.229*</w:t>
-                  </w:r>
-                </w:p>
-              </w:tc>
-              <w:tc>
-                <w:tcPr/>
-                <w:p>
-                  <w:pPr>
-                    <w:pStyle w:val="Compact"/>
-                    <w:jc w:val="right"/>
-                    <w:jc w:val="center"/>
-                  </w:pPr>
-                  <w:r>
-                    <w:t xml:space="preserve">0.131*</w:t>
-                  </w:r>
-                </w:p>
-              </w:tc>
-              <w:tc>
-                <w:tcPr/>
-                <w:p>
-                  <w:pPr>
-                    <w:pStyle w:val="Compact"/>
-                    <w:jc w:val="right"/>
-                    <w:jc w:val="center"/>
-                  </w:pPr>
-                  <w:r>
-                    <w:t xml:space="preserve">0.360***</w:t>
+                    <w:t xml:space="preserve">0.249**</w:t>
+                  </w:r>
+                </w:p>
+              </w:tc>
+              <w:tc>
+                <w:tcPr/>
+                <w:p>
+                  <w:pPr>
+                    <w:pStyle w:val="Compact"/>
+                    <w:jc w:val="right"/>
+                    <w:jc w:val="center"/>
+                  </w:pPr>
+                  <w:r>
+                    <w:t xml:space="preserve">0.140**</w:t>
+                  </w:r>
+                </w:p>
+              </w:tc>
+              <w:tc>
+                <w:tcPr/>
+                <w:p>
+                  <w:pPr>
+                    <w:pStyle w:val="Compact"/>
+                    <w:jc w:val="right"/>
+                    <w:jc w:val="center"/>
+                  </w:pPr>
+                  <w:r>
+                    <w:t xml:space="preserve">0.389***</w:t>
                   </w:r>
                 </w:p>
               </w:tc>
@@ -1225,33 +2603,33 @@
                     <w:jc w:val="center"/>
                   </w:pPr>
                   <w:r>
-                    <w:t xml:space="preserve">-0.051</w:t>
-                  </w:r>
-                </w:p>
-              </w:tc>
-              <w:tc>
-                <w:tcPr/>
-                <w:p>
-                  <w:pPr>
-                    <w:pStyle w:val="Compact"/>
-                    <w:jc w:val="right"/>
-                    <w:jc w:val="center"/>
-                  </w:pPr>
-                  <w:r>
-                    <w:t xml:space="preserve">0.191**</w:t>
-                  </w:r>
-                </w:p>
-              </w:tc>
-              <w:tc>
-                <w:tcPr/>
-                <w:p>
-                  <w:pPr>
-                    <w:pStyle w:val="Compact"/>
-                    <w:jc w:val="right"/>
-                    <w:jc w:val="center"/>
-                  </w:pPr>
-                  <w:r>
-                    <w:t xml:space="preserve">0.139†</w:t>
+                    <w:t xml:space="preserve">0.022</w:t>
+                  </w:r>
+                </w:p>
+              </w:tc>
+              <w:tc>
+                <w:tcPr/>
+                <w:p>
+                  <w:pPr>
+                    <w:pStyle w:val="Compact"/>
+                    <w:jc w:val="right"/>
+                    <w:jc w:val="center"/>
+                  </w:pPr>
+                  <w:r>
+                    <w:t xml:space="preserve">0.177**</w:t>
+                  </w:r>
+                </w:p>
+              </w:tc>
+              <w:tc>
+                <w:tcPr/>
+                <w:p>
+                  <w:pPr>
+                    <w:pStyle w:val="Compact"/>
+                    <w:jc w:val="right"/>
+                    <w:jc w:val="center"/>
+                  </w:pPr>
+                  <w:r>
+                    <w:t xml:space="preserve">0.199**</w:t>
                   </w:r>
                 </w:p>
               </w:tc>
@@ -1292,33 +2670,33 @@
                     <w:jc w:val="center"/>
                   </w:pPr>
                   <w:r>
-                    <w:t xml:space="preserve">0.167**</w:t>
-                  </w:r>
-                </w:p>
-              </w:tc>
-              <w:tc>
-                <w:tcPr/>
-                <w:p>
-                  <w:pPr>
-                    <w:pStyle w:val="Compact"/>
-                    <w:jc w:val="right"/>
-                    <w:jc w:val="center"/>
-                  </w:pPr>
-                  <w:r>
-                    <w:t xml:space="preserve">0.014</w:t>
-                  </w:r>
-                </w:p>
-              </w:tc>
-              <w:tc>
-                <w:tcPr/>
-                <w:p>
-                  <w:pPr>
-                    <w:pStyle w:val="Compact"/>
-                    <w:jc w:val="right"/>
-                    <w:jc w:val="center"/>
-                  </w:pPr>
-                  <w:r>
-                    <w:t xml:space="preserve">0.182**</w:t>
+                    <w:t xml:space="preserve">0.116†</w:t>
+                  </w:r>
+                </w:p>
+              </w:tc>
+              <w:tc>
+                <w:tcPr/>
+                <w:p>
+                  <w:pPr>
+                    <w:pStyle w:val="Compact"/>
+                    <w:jc w:val="right"/>
+                    <w:jc w:val="center"/>
+                  </w:pPr>
+                  <w:r>
+                    <w:t xml:space="preserve">0.019</w:t>
+                  </w:r>
+                </w:p>
+              </w:tc>
+              <w:tc>
+                <w:tcPr/>
+                <w:p>
+                  <w:pPr>
+                    <w:pStyle w:val="Compact"/>
+                    <w:jc w:val="right"/>
+                    <w:jc w:val="center"/>
+                  </w:pPr>
+                  <w:r>
+                    <w:t xml:space="preserve">0.135*</w:t>
                   </w:r>
                 </w:p>
               </w:tc>
@@ -1359,39 +2737,508 @@
                     <w:jc w:val="center"/>
                   </w:pPr>
                   <w:r>
-                    <w:t xml:space="preserve">-0.105</w:t>
-                  </w:r>
-                </w:p>
-              </w:tc>
-              <w:tc>
-                <w:tcPr/>
-                <w:p>
-                  <w:pPr>
-                    <w:pStyle w:val="Compact"/>
-                    <w:jc w:val="right"/>
-                    <w:jc w:val="center"/>
-                  </w:pPr>
-                  <w:r>
-                    <w:t xml:space="preserve">0.021</w:t>
-                  </w:r>
-                </w:p>
-              </w:tc>
-              <w:tc>
-                <w:tcPr/>
-                <w:p>
-                  <w:pPr>
-                    <w:pStyle w:val="Compact"/>
-                    <w:jc w:val="right"/>
-                    <w:jc w:val="center"/>
-                  </w:pPr>
-                  <w:r>
-                    <w:t xml:space="preserve">-0.085</w:t>
+                    <w:t xml:space="preserve">-0.073</w:t>
+                  </w:r>
+                </w:p>
+              </w:tc>
+              <w:tc>
+                <w:tcPr/>
+                <w:p>
+                  <w:pPr>
+                    <w:pStyle w:val="Compact"/>
+                    <w:jc w:val="right"/>
+                    <w:jc w:val="center"/>
+                  </w:pPr>
+                  <w:r>
+                    <w:t xml:space="preserve">0.024</w:t>
+                  </w:r>
+                </w:p>
+              </w:tc>
+              <w:tc>
+                <w:tcPr/>
+                <w:p>
+                  <w:pPr>
+                    <w:pStyle w:val="Compact"/>
+                    <w:jc w:val="right"/>
+                    <w:jc w:val="center"/>
+                  </w:pPr>
+                  <w:r>
+                    <w:t xml:space="preserve">-0.049</w:t>
                   </w:r>
                 </w:p>
               </w:tc>
             </w:tr>
           </w:tbl>
-          <w:bookmarkEnd w:id="41"/>
+          <w:bookmarkEnd w:id="48"/>
+          <w:p/>
+        </w:tc>
+      </w:tr>
+    </w:tbl>
+    <w:bookmarkEnd w:id="49"/>
+    <w:bookmarkStart w:id="51" w:name="demographic-control-coefficients"/>
+    <w:p>
+      <w:pPr>
+        <w:pStyle w:val="Heading1"/>
+      </w:pPr>
+      <w:r>
+        <w:t xml:space="preserve">Demographic control coefficients</w:t>
+      </w:r>
+    </w:p>
+    <w:p>
+      <w:pPr>
+        <w:pStyle w:val="FirstParagraph"/>
+      </w:pPr>
+      <w:r>
+        <w:t xml:space="preserve">Every model above and in the main text controls for age, gender (male), race (white), education, and household income, but these coefficients are omitted from the path diagrams and decomposition tables for readability. Table S6 reports the standardized control coefficients from the full combined model reported in the main text (HIER-INDIV and EGAL-COMM in place of the four separate worldview measures; main-text Table 6).</w:t>
+      </w:r>
+    </w:p>
+    <w:tbl>
+      <w:tblPr>
+        <w:tblStyle w:val="Table"/>
+        <w:tblW w:type="pct" w:w="5000"/>
+        <w:tblLayout w:type="fixed"/>
+        <w:tblLook w:firstRow="0" w:lastRow="0" w:firstColumn="0" w:lastColumn="0" w:noHBand="0" w:noVBand="0" w:val="0000"/>
+      </w:tblPr>
+      <w:tblGrid>
+        <w:gridCol w:w="7920"/>
+      </w:tblGrid>
+      <w:tr>
+        <w:tc>
+          <w:tcPr/>
+          <w:bookmarkStart w:id="50" w:name="tbl-hiec-controls"/>
+          <w:p>
+            <w:pPr>
+              <w:jc w:val="center"/>
+            </w:pPr>
+            <w:pPr>
+              <w:jc w:val="left"/>
+              <w:spacing w:before="200"/>
+              <w:pStyle w:val="ImageCaption"/>
+            </w:pPr>
+            <w:r>
+              <w:t xml:space="preserve">Table 5: Standardized demographic control coefficients from the full combined model reported in the main text (HIER-INDIV/EGAL-COMM), by outcome († p&lt;0.10, * p&lt;0.05, ** p&lt;0.01, *** p&lt;0.001)</w:t>
+            </w:r>
+          </w:p>
+          <w:tbl>
+            <w:tblPr>
+              <w:tblStyle w:val="Table"/>
+              <w:tblW w:type="auto" w:w="0"/>
+              <w:tblLook w:firstRow="1" w:lastRow="0" w:firstColumn="0" w:lastColumn="0" w:noHBand="0" w:noVBand="0" w:val="0020"/>
+            </w:tblPr>
+            <w:tblGrid>
+              <w:gridCol w:w="1584"/>
+              <w:gridCol w:w="1584"/>
+              <w:gridCol w:w="1584"/>
+              <w:gridCol w:w="1584"/>
+              <w:gridCol w:w="1584"/>
+            </w:tblGrid>
+            <w:tr>
+              <w:trPr>
+                <w:tblHeader w:val="on"/>
+              </w:trPr>
+              <w:tc>
+                <w:tcPr/>
+                <w:p>
+                  <w:pPr>
+                    <w:pStyle w:val="Compact"/>
+                    <w:jc w:val="left"/>
+                    <w:jc w:val="center"/>
+                  </w:pPr>
+                  <w:r>
+                    <w:t xml:space="preserve">Control</w:t>
+                  </w:r>
+                </w:p>
+              </w:tc>
+              <w:tc>
+                <w:tcPr/>
+                <w:p>
+                  <w:pPr>
+                    <w:pStyle w:val="Compact"/>
+                    <w:jc w:val="right"/>
+                    <w:jc w:val="center"/>
+                  </w:pPr>
+                  <w:r>
+                    <w:t xml:space="preserve">NEP</w:t>
+                  </w:r>
+                </w:p>
+              </w:tc>
+              <w:tc>
+                <w:tcPr/>
+                <w:p>
+                  <w:pPr>
+                    <w:pStyle w:val="Compact"/>
+                    <w:jc w:val="right"/>
+                    <w:jc w:val="center"/>
+                  </w:pPr>
+                  <w:r>
+                    <w:t xml:space="preserve">CNS</w:t>
+                  </w:r>
+                </w:p>
+              </w:tc>
+              <w:tc>
+                <w:tcPr/>
+                <w:p>
+                  <w:pPr>
+                    <w:pStyle w:val="Compact"/>
+                    <w:jc w:val="right"/>
+                    <w:jc w:val="center"/>
+                  </w:pPr>
+                  <w:r>
+                    <w:t xml:space="preserve">Public</w:t>
+                  </w:r>
+                </w:p>
+              </w:tc>
+              <w:tc>
+                <w:tcPr/>
+                <w:p>
+                  <w:pPr>
+                    <w:pStyle w:val="Compact"/>
+                    <w:jc w:val="right"/>
+                    <w:jc w:val="center"/>
+                  </w:pPr>
+                  <w:r>
+                    <w:t xml:space="preserve">Private</w:t>
+                  </w:r>
+                </w:p>
+              </w:tc>
+            </w:tr>
+            <w:tr>
+              <w:tc>
+                <w:tcPr/>
+                <w:p>
+                  <w:pPr>
+                    <w:pStyle w:val="Compact"/>
+                    <w:jc w:val="left"/>
+                    <w:jc w:val="center"/>
+                  </w:pPr>
+                  <w:r>
+                    <w:t xml:space="preserve">Age</w:t>
+                  </w:r>
+                </w:p>
+              </w:tc>
+              <w:tc>
+                <w:tcPr/>
+                <w:p>
+                  <w:pPr>
+                    <w:pStyle w:val="Compact"/>
+                    <w:jc w:val="right"/>
+                    <w:jc w:val="center"/>
+                  </w:pPr>
+                  <w:r>
+                    <w:t xml:space="preserve">-0.040</w:t>
+                  </w:r>
+                </w:p>
+              </w:tc>
+              <w:tc>
+                <w:tcPr/>
+                <w:p>
+                  <w:pPr>
+                    <w:pStyle w:val="Compact"/>
+                    <w:jc w:val="right"/>
+                    <w:jc w:val="center"/>
+                  </w:pPr>
+                  <w:r>
+                    <w:t xml:space="preserve">0.090†</w:t>
+                  </w:r>
+                </w:p>
+              </w:tc>
+              <w:tc>
+                <w:tcPr/>
+                <w:p>
+                  <w:pPr>
+                    <w:pStyle w:val="Compact"/>
+                    <w:jc w:val="right"/>
+                    <w:jc w:val="center"/>
+                  </w:pPr>
+                  <w:r>
+                    <w:t xml:space="preserve">-0.205***</w:t>
+                  </w:r>
+                </w:p>
+              </w:tc>
+              <w:tc>
+                <w:tcPr/>
+                <w:p>
+                  <w:pPr>
+                    <w:pStyle w:val="Compact"/>
+                    <w:jc w:val="right"/>
+                    <w:jc w:val="center"/>
+                  </w:pPr>
+                  <w:r>
+                    <w:t xml:space="preserve">0.147**</w:t>
+                  </w:r>
+                </w:p>
+              </w:tc>
+            </w:tr>
+            <w:tr>
+              <w:tc>
+                <w:tcPr/>
+                <w:p>
+                  <w:pPr>
+                    <w:pStyle w:val="Compact"/>
+                    <w:jc w:val="left"/>
+                    <w:jc w:val="center"/>
+                  </w:pPr>
+                  <w:r>
+                    <w:t xml:space="preserve">Male</w:t>
+                  </w:r>
+                </w:p>
+              </w:tc>
+              <w:tc>
+                <w:tcPr/>
+                <w:p>
+                  <w:pPr>
+                    <w:pStyle w:val="Compact"/>
+                    <w:jc w:val="right"/>
+                    <w:jc w:val="center"/>
+                  </w:pPr>
+                  <w:r>
+                    <w:t xml:space="preserve">-0.072</w:t>
+                  </w:r>
+                </w:p>
+              </w:tc>
+              <w:tc>
+                <w:tcPr/>
+                <w:p>
+                  <w:pPr>
+                    <w:pStyle w:val="Compact"/>
+                    <w:jc w:val="right"/>
+                    <w:jc w:val="center"/>
+                  </w:pPr>
+                  <w:r>
+                    <w:t xml:space="preserve">0.010</w:t>
+                  </w:r>
+                </w:p>
+              </w:tc>
+              <w:tc>
+                <w:tcPr/>
+                <w:p>
+                  <w:pPr>
+                    <w:pStyle w:val="Compact"/>
+                    <w:jc w:val="right"/>
+                    <w:jc w:val="center"/>
+                  </w:pPr>
+                  <w:r>
+                    <w:t xml:space="preserve">0.068</w:t>
+                  </w:r>
+                </w:p>
+              </w:tc>
+              <w:tc>
+                <w:tcPr/>
+                <w:p>
+                  <w:pPr>
+                    <w:pStyle w:val="Compact"/>
+                    <w:jc w:val="right"/>
+                    <w:jc w:val="center"/>
+                  </w:pPr>
+                  <w:r>
+                    <w:t xml:space="preserve">-0.132**</w:t>
+                  </w:r>
+                </w:p>
+              </w:tc>
+            </w:tr>
+            <w:tr>
+              <w:tc>
+                <w:tcPr/>
+                <w:p>
+                  <w:pPr>
+                    <w:pStyle w:val="Compact"/>
+                    <w:jc w:val="left"/>
+                    <w:jc w:val="center"/>
+                  </w:pPr>
+                  <w:r>
+                    <w:t xml:space="preserve">White</w:t>
+                  </w:r>
+                </w:p>
+              </w:tc>
+              <w:tc>
+                <w:tcPr/>
+                <w:p>
+                  <w:pPr>
+                    <w:pStyle w:val="Compact"/>
+                    <w:jc w:val="right"/>
+                    <w:jc w:val="center"/>
+                  </w:pPr>
+                  <w:r>
+                    <w:t xml:space="preserve">-0.030</w:t>
+                  </w:r>
+                </w:p>
+              </w:tc>
+              <w:tc>
+                <w:tcPr/>
+                <w:p>
+                  <w:pPr>
+                    <w:pStyle w:val="Compact"/>
+                    <w:jc w:val="right"/>
+                    <w:jc w:val="center"/>
+                  </w:pPr>
+                  <w:r>
+                    <w:t xml:space="preserve">0.026</w:t>
+                  </w:r>
+                </w:p>
+              </w:tc>
+              <w:tc>
+                <w:tcPr/>
+                <w:p>
+                  <w:pPr>
+                    <w:pStyle w:val="Compact"/>
+                    <w:jc w:val="right"/>
+                    <w:jc w:val="center"/>
+                  </w:pPr>
+                  <w:r>
+                    <w:t xml:space="preserve">-0.012</w:t>
+                  </w:r>
+                </w:p>
+              </w:tc>
+              <w:tc>
+                <w:tcPr/>
+                <w:p>
+                  <w:pPr>
+                    <w:pStyle w:val="Compact"/>
+                    <w:jc w:val="right"/>
+                    <w:jc w:val="center"/>
+                  </w:pPr>
+                  <w:r>
+                    <w:t xml:space="preserve">0.068</w:t>
+                  </w:r>
+                </w:p>
+              </w:tc>
+            </w:tr>
+            <w:tr>
+              <w:tc>
+                <w:tcPr/>
+                <w:p>
+                  <w:pPr>
+                    <w:pStyle w:val="Compact"/>
+                    <w:jc w:val="left"/>
+                    <w:jc w:val="center"/>
+                  </w:pPr>
+                  <w:r>
+                    <w:t xml:space="preserve">Education</w:t>
+                  </w:r>
+                </w:p>
+              </w:tc>
+              <w:tc>
+                <w:tcPr/>
+                <w:p>
+                  <w:pPr>
+                    <w:pStyle w:val="Compact"/>
+                    <w:jc w:val="right"/>
+                    <w:jc w:val="center"/>
+                  </w:pPr>
+                  <w:r>
+                    <w:t xml:space="preserve">-0.078</w:t>
+                  </w:r>
+                </w:p>
+              </w:tc>
+              <w:tc>
+                <w:tcPr/>
+                <w:p>
+                  <w:pPr>
+                    <w:pStyle w:val="Compact"/>
+                    <w:jc w:val="right"/>
+                    <w:jc w:val="center"/>
+                  </w:pPr>
+                  <w:r>
+                    <w:t xml:space="preserve">0.019</w:t>
+                  </w:r>
+                </w:p>
+              </w:tc>
+              <w:tc>
+                <w:tcPr/>
+                <w:p>
+                  <w:pPr>
+                    <w:pStyle w:val="Compact"/>
+                    <w:jc w:val="right"/>
+                    <w:jc w:val="center"/>
+                  </w:pPr>
+                  <w:r>
+                    <w:t xml:space="preserve">0.064</w:t>
+                  </w:r>
+                </w:p>
+              </w:tc>
+              <w:tc>
+                <w:tcPr/>
+                <w:p>
+                  <w:pPr>
+                    <w:pStyle w:val="Compact"/>
+                    <w:jc w:val="right"/>
+                    <w:jc w:val="center"/>
+                  </w:pPr>
+                  <w:r>
+                    <w:t xml:space="preserve">0.050</w:t>
+                  </w:r>
+                </w:p>
+              </w:tc>
+            </w:tr>
+            <w:tr>
+              <w:tc>
+                <w:tcPr/>
+                <w:p>
+                  <w:pPr>
+                    <w:pStyle w:val="Compact"/>
+                    <w:jc w:val="left"/>
+                    <w:jc w:val="center"/>
+                  </w:pPr>
+                  <w:r>
+                    <w:t xml:space="preserve">Household income</w:t>
+                  </w:r>
+                </w:p>
+              </w:tc>
+              <w:tc>
+                <w:tcPr/>
+                <w:p>
+                  <w:pPr>
+                    <w:pStyle w:val="Compact"/>
+                    <w:jc w:val="right"/>
+                    <w:jc w:val="center"/>
+                  </w:pPr>
+                  <w:r>
+                    <w:t xml:space="preserve">-0.066</w:t>
+                  </w:r>
+                </w:p>
+              </w:tc>
+              <w:tc>
+                <w:tcPr/>
+                <w:p>
+                  <w:pPr>
+                    <w:pStyle w:val="Compact"/>
+                    <w:jc w:val="right"/>
+                    <w:jc w:val="center"/>
+                  </w:pPr>
+                  <w:r>
+                    <w:t xml:space="preserve">-0.045</w:t>
+                  </w:r>
+                </w:p>
+              </w:tc>
+              <w:tc>
+                <w:tcPr/>
+                <w:p>
+                  <w:pPr>
+                    <w:pStyle w:val="Compact"/>
+                    <w:jc w:val="right"/>
+                    <w:jc w:val="center"/>
+                  </w:pPr>
+                  <w:r>
+                    <w:t xml:space="preserve">0.095*</w:t>
+                  </w:r>
+                </w:p>
+              </w:tc>
+              <w:tc>
+                <w:tcPr/>
+                <w:p>
+                  <w:pPr>
+                    <w:pStyle w:val="Compact"/>
+                    <w:jc w:val="right"/>
+                    <w:jc w:val="center"/>
+                  </w:pPr>
+                  <w:r>
+                    <w:t xml:space="preserve">0.128**</w:t>
+                  </w:r>
+                </w:p>
+              </w:tc>
+            </w:tr>
+          </w:tbl>
+          <w:bookmarkEnd w:id="50"/>
           <w:p/>
         </w:tc>
       </w:tr>
@@ -1401,8 +3248,8 @@
         <w:br w:type="page"/>
       </w:r>
     </w:p>
-    <w:bookmarkEnd w:id="42"/>
-    <w:bookmarkStart w:id="43" w:name="references"/>
+    <w:bookmarkEnd w:id="51"/>
+    <w:bookmarkStart w:id="52" w:name="references"/>
     <w:p>
       <w:pPr>
         <w:pStyle w:val="Heading1"/>
@@ -1416,7 +3263,7 @@
         <w:pStyle w:val="FirstParagraph"/>
       </w:pPr>
     </w:p>
-    <w:bookmarkEnd w:id="43"/>
+    <w:bookmarkEnd w:id="52"/>
     <w:sectPr>
       <w:headerReference r:id="rId12" w:type="even"/>
       <w:headerReference r:id="rId13" w:type="default"/>

</xml_diff>